<commit_message>
Documento: enlace al repositorio y seccion del sitio de sustentacion; PDF final
Co-Authored-By: Claude Sonnet 5.5 <noreply@anthropic.com>
</commit_message>
<xml_diff>
--- a/docs/ParkEasy_UNAB_Documento_Proyecto.docx
+++ b/docs/ParkEasy_UNAB_Documento_Proyecto.docx
@@ -460,6 +460,7 @@
     <w:p>
       <w:pPr>
         <w:pStyle w:val="Heading2"/>
+        <w:pageBreakBefore/>
       </w:pPr>
       <w:r>
         <w:t>3. Catálogo de 10 dispositivos</w:t>
@@ -3644,6 +3645,296 @@
         <w:t xml:space="preserve"> y nunca subirse al repositorio público.</w:t>
       </w:r>
     </w:p>
+    <w:p>
+      <w:r>
+        <w:rPr>
+          <w:b/>
+        </w:rPr>
+        <w:t xml:space="preserve">Repositorio en GitHub: </w:t>
+      </w:r>
+      <w:hyperlink r:id="rId15">
+        <w:r>
+          <w:rPr>
+            <w:u w:val="single"/>
+            <w:color w:val="0563C1"/>
+          </w:rPr>
+          <w:t>https://github.com/JaimeMrF/parkeasy-unab-iot</w:t>
+        </w:r>
+      </w:hyperlink>
+    </w:p>
+    <w:p>
+      <w:r>
+        <w:t>Incluye las plantillas DTDL, los scripts Python, los dos proyectos Wokwi, el lanzador de la flota, el CSV de replay, este documento y las capturas. Las credenciales reales no se versionan (solo el ejemplo devices.env.example.csv).</w:t>
+      </w:r>
+    </w:p>
+    <w:p>
+      <w:pPr>
+        <w:pStyle w:val="Heading2"/>
+      </w:pPr>
+      <w:r>
+        <w:t>9. Sitio web de sustentación</w:t>
+      </w:r>
+    </w:p>
+    <w:p>
+      <w:r>
+        <w:t>Como apoyo a la sustentación se construyó un sitio web (React + Vite, carpeta sustentacion-app/ del repositorio) que presenta el proyecto de forma visual e interactiva. No reemplaza a IoT Central: los datos oficiales están en la aplicación de Azure; el sitio es una guía didáctica para explicar la arquitectura, el catálogo y las reglas.</w:t>
+      </w:r>
+    </w:p>
+    <w:p>
+      <w:pPr>
+        <w:jc w:val="center"/>
+      </w:pPr>
+      <w:r>
+        <w:drawing>
+          <wp:inline xmlns:a="http://schemas.openxmlformats.org/drawingml/2006/main" xmlns:pic="http://schemas.openxmlformats.org/drawingml/2006/picture">
+            <wp:extent cx="5303520" cy="2612681"/>
+            <wp:docPr id="7" name="Picture 7"/>
+            <wp:cNvGraphicFramePr>
+              <a:graphicFrameLocks noChangeAspect="1"/>
+            </wp:cNvGraphicFramePr>
+            <a:graphic>
+              <a:graphicData uri="http://schemas.openxmlformats.org/drawingml/2006/picture">
+                <pic:pic>
+                  <pic:nvPicPr>
+                    <pic:cNvPr id="0" name="sitio_inicio.jpg"/>
+                    <pic:cNvPicPr/>
+                  </pic:nvPicPr>
+                  <pic:blipFill>
+                    <a:blip r:embed="rId16"/>
+                    <a:stretch>
+                      <a:fillRect/>
+                    </a:stretch>
+                  </pic:blipFill>
+                  <pic:spPr>
+                    <a:xfrm>
+                      <a:off x="0" y="0"/>
+                      <a:ext cx="5303520" cy="2612681"/>
+                    </a:xfrm>
+                    <a:prstGeom prst="rect"/>
+                  </pic:spPr>
+                </pic:pic>
+              </a:graphicData>
+            </a:graphic>
+          </wp:inline>
+        </w:drawing>
+      </w:r>
+    </w:p>
+    <w:p>
+      <w:pPr>
+        <w:jc w:val="center"/>
+      </w:pPr>
+      <w:r>
+        <w:rPr>
+          <w:i/>
+          <w:sz w:val="18"/>
+        </w:rPr>
+        <w:t>Inicio: resumen del proyecto (10 dispositivos, 9 orígenes de envío, 6 intervalos distintos, 3 Rules activas).</w:t>
+      </w:r>
+    </w:p>
+    <w:p>
+      <w:pPr>
+        <w:jc w:val="center"/>
+      </w:pPr>
+      <w:r>
+        <w:drawing>
+          <wp:inline xmlns:a="http://schemas.openxmlformats.org/drawingml/2006/main" xmlns:pic="http://schemas.openxmlformats.org/drawingml/2006/picture">
+            <wp:extent cx="5303520" cy="2612681"/>
+            <wp:docPr id="8" name="Picture 8"/>
+            <wp:cNvGraphicFramePr>
+              <a:graphicFrameLocks noChangeAspect="1"/>
+            </wp:cNvGraphicFramePr>
+            <a:graphic>
+              <a:graphicData uri="http://schemas.openxmlformats.org/drawingml/2006/picture">
+                <pic:pic>
+                  <pic:nvPicPr>
+                    <pic:cNvPr id="0" name="sitio_arquitectura.jpg"/>
+                    <pic:cNvPicPr/>
+                  </pic:nvPicPr>
+                  <pic:blipFill>
+                    <a:blip r:embed="rId17"/>
+                    <a:stretch>
+                      <a:fillRect/>
+                    </a:stretch>
+                  </pic:blipFill>
+                  <pic:spPr>
+                    <a:xfrm>
+                      <a:off x="0" y="0"/>
+                      <a:ext cx="5303520" cy="2612681"/>
+                    </a:xfrm>
+                    <a:prstGeom prst="rect"/>
+                  </pic:spPr>
+                </pic:pic>
+              </a:graphicData>
+            </a:graphic>
+          </wp:inline>
+        </w:drawing>
+      </w:r>
+    </w:p>
+    <w:p>
+      <w:pPr>
+        <w:jc w:val="center"/>
+      </w:pPr>
+      <w:r>
+        <w:rPr>
+          <w:i/>
+          <w:sz w:val="18"/>
+        </w:rPr>
+        <w:t>Arquitectura: diagrama interactivo; al hacer clic en un dispositivo se simula el viaje del paquete hasta IoT Central y la reacción del Control Room.</w:t>
+      </w:r>
+    </w:p>
+    <w:p>
+      <w:pPr>
+        <w:jc w:val="center"/>
+      </w:pPr>
+      <w:r>
+        <w:drawing>
+          <wp:inline xmlns:a="http://schemas.openxmlformats.org/drawingml/2006/main" xmlns:pic="http://schemas.openxmlformats.org/drawingml/2006/picture">
+            <wp:extent cx="5303520" cy="2612681"/>
+            <wp:docPr id="9" name="Picture 9"/>
+            <wp:cNvGraphicFramePr>
+              <a:graphicFrameLocks noChangeAspect="1"/>
+            </wp:cNvGraphicFramePr>
+            <a:graphic>
+              <a:graphicData uri="http://schemas.openxmlformats.org/drawingml/2006/picture">
+                <pic:pic>
+                  <pic:nvPicPr>
+                    <pic:cNvPr id="0" name="sitio_parqueadero3d.jpg"/>
+                    <pic:cNvPicPr/>
+                  </pic:nvPicPr>
+                  <pic:blipFill>
+                    <a:blip r:embed="rId18"/>
+                    <a:stretch>
+                      <a:fillRect/>
+                    </a:stretch>
+                  </pic:blipFill>
+                  <pic:spPr>
+                    <a:xfrm>
+                      <a:off x="0" y="0"/>
+                      <a:ext cx="5303520" cy="2612681"/>
+                    </a:xfrm>
+                    <a:prstGeom prst="rect"/>
+                  </pic:spPr>
+                </pic:pic>
+              </a:graphicData>
+            </a:graphic>
+          </wp:inline>
+        </w:drawing>
+      </w:r>
+    </w:p>
+    <w:p>
+      <w:pPr>
+        <w:jc w:val="center"/>
+      </w:pPr>
+      <w:r>
+        <w:rPr>
+          <w:i/>
+          <w:sz w:val="18"/>
+        </w:rPr>
+        <w:t>Parqueadero 3D: estación con slots, tótem, sensores y enlace a la nube; cada objeto corresponde a un dispositivo del catálogo.</w:t>
+      </w:r>
+    </w:p>
+    <w:p>
+      <w:pPr>
+        <w:jc w:val="center"/>
+      </w:pPr>
+      <w:r>
+        <w:drawing>
+          <wp:inline xmlns:a="http://schemas.openxmlformats.org/drawingml/2006/main" xmlns:pic="http://schemas.openxmlformats.org/drawingml/2006/picture">
+            <wp:extent cx="5303520" cy="2612681"/>
+            <wp:docPr id="10" name="Picture 10"/>
+            <wp:cNvGraphicFramePr>
+              <a:graphicFrameLocks noChangeAspect="1"/>
+            </wp:cNvGraphicFramePr>
+            <a:graphic>
+              <a:graphicData uri="http://schemas.openxmlformats.org/drawingml/2006/picture">
+                <pic:pic>
+                  <pic:nvPicPr>
+                    <pic:cNvPr id="0" name="sitio_controlroom.jpg"/>
+                    <pic:cNvPicPr/>
+                  </pic:nvPicPr>
+                  <pic:blipFill>
+                    <a:blip r:embed="rId19"/>
+                    <a:stretch>
+                      <a:fillRect/>
+                    </a:stretch>
+                  </pic:blipFill>
+                  <pic:spPr>
+                    <a:xfrm>
+                      <a:off x="0" y="0"/>
+                      <a:ext cx="5303520" cy="2612681"/>
+                    </a:xfrm>
+                    <a:prstGeom prst="rect"/>
+                  </pic:spPr>
+                </pic:pic>
+              </a:graphicData>
+            </a:graphic>
+          </wp:inline>
+        </w:drawing>
+      </w:r>
+    </w:p>
+    <w:p>
+      <w:pPr>
+        <w:jc w:val="center"/>
+      </w:pPr>
+      <w:r>
+        <w:rPr>
+          <w:i/>
+          <w:sz w:val="18"/>
+        </w:rPr>
+        <w:t>Control Room: capturas reales del dashboard personalizado de IoT Central (logo, mapa de zonas, KPIs y gráficos).</w:t>
+      </w:r>
+    </w:p>
+    <w:p>
+      <w:pPr>
+        <w:jc w:val="center"/>
+      </w:pPr>
+      <w:r>
+        <w:drawing>
+          <wp:inline xmlns:a="http://schemas.openxmlformats.org/drawingml/2006/main" xmlns:pic="http://schemas.openxmlformats.org/drawingml/2006/picture">
+            <wp:extent cx="5303520" cy="2612681"/>
+            <wp:docPr id="11" name="Picture 11"/>
+            <wp:cNvGraphicFramePr>
+              <a:graphicFrameLocks noChangeAspect="1"/>
+            </wp:cNvGraphicFramePr>
+            <a:graphic>
+              <a:graphicData uri="http://schemas.openxmlformats.org/drawingml/2006/picture">
+                <pic:pic>
+                  <pic:nvPicPr>
+                    <pic:cNvPr id="0" name="sitio_reglas.jpg"/>
+                    <pic:cNvPicPr/>
+                  </pic:nvPicPr>
+                  <pic:blipFill>
+                    <a:blip r:embed="rId20"/>
+                    <a:stretch>
+                      <a:fillRect/>
+                    </a:stretch>
+                  </pic:blipFill>
+                  <pic:spPr>
+                    <a:xfrm>
+                      <a:off x="0" y="0"/>
+                      <a:ext cx="5303520" cy="2612681"/>
+                    </a:xfrm>
+                    <a:prstGeom prst="rect"/>
+                  </pic:spPr>
+                </pic:pic>
+              </a:graphicData>
+            </a:graphic>
+          </wp:inline>
+        </w:drawing>
+      </w:r>
+    </w:p>
+    <w:p>
+      <w:pPr>
+        <w:jc w:val="center"/>
+      </w:pPr>
+      <w:r>
+        <w:rPr>
+          <w:i/>
+          <w:sz w:val="18"/>
+        </w:rPr>
+        <w:t>Reglas: simulador con las 3 Rules (ocupación alta, sobretemperatura de carga y calidad de aire crítica) y sus umbrales.</w:t>
+      </w:r>
+    </w:p>
     <w:sectPr>
       <w:pgSz w:w="12240" w:h="15840"/>
       <w:pgMar w:top="1440" w:right="1800" w:bottom="1440" w:left="1800" w:header="720" w:footer="720" w:gutter="0"/>

</xml_diff>

<commit_message>
Documento: se elimina la nota de alcance; PDF actualizado
Co-Authored-By: Claude Sonnet 5.5 <noreply@anthropic.com>
</commit_message>
<xml_diff>
--- a/docs/ParkEasy_UNAB_Documento_Proyecto.docx
+++ b/docs/ParkEasy_UNAB_Documento_Proyecto.docx
@@ -231,7 +231,7 @@
       <w:r>
         <w:fldChar w:fldCharType="separate"/>
       </w:r>
-      <w:hyperlink w:anchor="_Toc241521607" w:history="1">
+      <w:hyperlink w:anchor="_Toc241521833" w:history="1">
         <w:r>
           <w:rPr>
             <w:rStyle w:val="Hyperlink"/>
@@ -258,7 +258,7 @@
             <w:noProof/>
             <w:webHidden/>
           </w:rPr>
-          <w:instrText xml:space="preserve"> PAGEREF _Toc241521607 \h </w:instrText>
+          <w:instrText xml:space="preserve"> PAGEREF _Toc241521833 \h </w:instrText>
         </w:r>
         <w:r>
           <w:rPr>
@@ -304,7 +304,7 @@
           <w14:ligatures w14:val="standardContextual"/>
         </w:rPr>
       </w:pPr>
-      <w:hyperlink w:anchor="_Toc241521608" w:history="1">
+      <w:hyperlink w:anchor="_Toc241521834" w:history="1">
         <w:r>
           <w:rPr>
             <w:rStyle w:val="Hyperlink"/>
@@ -331,7 +331,7 @@
             <w:noProof/>
             <w:webHidden/>
           </w:rPr>
-          <w:instrText xml:space="preserve"> PAGEREF _Toc241521608 \h </w:instrText>
+          <w:instrText xml:space="preserve"> PAGEREF _Toc241521834 \h </w:instrText>
         </w:r>
         <w:r>
           <w:rPr>
@@ -377,7 +377,7 @@
           <w14:ligatures w14:val="standardContextual"/>
         </w:rPr>
       </w:pPr>
-      <w:hyperlink w:anchor="_Toc241521609" w:history="1">
+      <w:hyperlink w:anchor="_Toc241521835" w:history="1">
         <w:r>
           <w:rPr>
             <w:rStyle w:val="Hyperlink"/>
@@ -404,7 +404,7 @@
             <w:noProof/>
             <w:webHidden/>
           </w:rPr>
-          <w:instrText xml:space="preserve"> PAGEREF _Toc241521609 \h </w:instrText>
+          <w:instrText xml:space="preserve"> PAGEREF _Toc241521835 \h </w:instrText>
         </w:r>
         <w:r>
           <w:rPr>
@@ -450,7 +450,7 @@
           <w14:ligatures w14:val="standardContextual"/>
         </w:rPr>
       </w:pPr>
-      <w:hyperlink w:anchor="_Toc241521610" w:history="1">
+      <w:hyperlink w:anchor="_Toc241521836" w:history="1">
         <w:r>
           <w:rPr>
             <w:rStyle w:val="Hyperlink"/>
@@ -477,7 +477,7 @@
             <w:noProof/>
             <w:webHidden/>
           </w:rPr>
-          <w:instrText xml:space="preserve"> PAGEREF _Toc241521610 \h </w:instrText>
+          <w:instrText xml:space="preserve"> PAGEREF _Toc241521836 \h </w:instrText>
         </w:r>
         <w:r>
           <w:rPr>
@@ -523,7 +523,7 @@
           <w14:ligatures w14:val="standardContextual"/>
         </w:rPr>
       </w:pPr>
-      <w:hyperlink w:anchor="_Toc241521611" w:history="1">
+      <w:hyperlink w:anchor="_Toc241521837" w:history="1">
         <w:r>
           <w:rPr>
             <w:rStyle w:val="Hyperlink"/>
@@ -550,7 +550,7 @@
             <w:noProof/>
             <w:webHidden/>
           </w:rPr>
-          <w:instrText xml:space="preserve"> PAGEREF _Toc241521611 \h </w:instrText>
+          <w:instrText xml:space="preserve"> PAGEREF _Toc241521837 \h </w:instrText>
         </w:r>
         <w:r>
           <w:rPr>
@@ -596,7 +596,7 @@
           <w14:ligatures w14:val="standardContextual"/>
         </w:rPr>
       </w:pPr>
-      <w:hyperlink w:anchor="_Toc241521612" w:history="1">
+      <w:hyperlink w:anchor="_Toc241521838" w:history="1">
         <w:r>
           <w:rPr>
             <w:rStyle w:val="Hyperlink"/>
@@ -623,7 +623,7 @@
             <w:noProof/>
             <w:webHidden/>
           </w:rPr>
-          <w:instrText xml:space="preserve"> PAGEREF _Toc241521612 \h </w:instrText>
+          <w:instrText xml:space="preserve"> PAGEREF _Toc241521838 \h </w:instrText>
         </w:r>
         <w:r>
           <w:rPr>
@@ -669,7 +669,7 @@
           <w14:ligatures w14:val="standardContextual"/>
         </w:rPr>
       </w:pPr>
-      <w:hyperlink w:anchor="_Toc241521613" w:history="1">
+      <w:hyperlink w:anchor="_Toc241521839" w:history="1">
         <w:r>
           <w:rPr>
             <w:rStyle w:val="Hyperlink"/>
@@ -696,7 +696,7 @@
             <w:noProof/>
             <w:webHidden/>
           </w:rPr>
-          <w:instrText xml:space="preserve"> PAGEREF _Toc241521613 \h </w:instrText>
+          <w:instrText xml:space="preserve"> PAGEREF _Toc241521839 \h </w:instrText>
         </w:r>
         <w:r>
           <w:rPr>
@@ -742,7 +742,7 @@
           <w14:ligatures w14:val="standardContextual"/>
         </w:rPr>
       </w:pPr>
-      <w:hyperlink w:anchor="_Toc241521614" w:history="1">
+      <w:hyperlink w:anchor="_Toc241521840" w:history="1">
         <w:r>
           <w:rPr>
             <w:rStyle w:val="Hyperlink"/>
@@ -769,7 +769,7 @@
             <w:noProof/>
             <w:webHidden/>
           </w:rPr>
-          <w:instrText xml:space="preserve"> PAGEREF _Toc241521614 \h </w:instrText>
+          <w:instrText xml:space="preserve"> PAGEREF _Toc241521840 \h </w:instrText>
         </w:r>
         <w:r>
           <w:rPr>
@@ -815,7 +815,7 @@
           <w14:ligatures w14:val="standardContextual"/>
         </w:rPr>
       </w:pPr>
-      <w:hyperlink w:anchor="_Toc241521615" w:history="1">
+      <w:hyperlink w:anchor="_Toc241521841" w:history="1">
         <w:r>
           <w:rPr>
             <w:rStyle w:val="Hyperlink"/>
@@ -842,7 +842,7 @@
             <w:noProof/>
             <w:webHidden/>
           </w:rPr>
-          <w:instrText xml:space="preserve"> PAGEREF _Toc241521615 \h </w:instrText>
+          <w:instrText xml:space="preserve"> PAGEREF _Toc241521841 \h </w:instrText>
         </w:r>
         <w:r>
           <w:rPr>
@@ -888,7 +888,7 @@
           <w14:ligatures w14:val="standardContextual"/>
         </w:rPr>
       </w:pPr>
-      <w:hyperlink w:anchor="_Toc241521616" w:history="1">
+      <w:hyperlink w:anchor="_Toc241521842" w:history="1">
         <w:r>
           <w:rPr>
             <w:rStyle w:val="Hyperlink"/>
@@ -915,7 +915,7 @@
             <w:noProof/>
             <w:webHidden/>
           </w:rPr>
-          <w:instrText xml:space="preserve"> PAGEREF _Toc241521616 \h </w:instrText>
+          <w:instrText xml:space="preserve"> PAGEREF _Toc241521842 \h </w:instrText>
         </w:r>
         <w:r>
           <w:rPr>
@@ -966,7 +966,7 @@
       <w:pPr>
         <w:pStyle w:val="Heading1"/>
       </w:pPr>
-      <w:bookmarkStart w:id="0" w:name="_Toc241521607"/>
+      <w:bookmarkStart w:id="0" w:name="_Toc241521833"/>
       <w:r>
         <w:lastRenderedPageBreak/>
         <w:t>Resumen</w:t>
@@ -1010,7 +1010,7 @@
       <w:pPr>
         <w:pStyle w:val="Heading1"/>
       </w:pPr>
-      <w:bookmarkStart w:id="1" w:name="_Toc241521608"/>
+      <w:bookmarkStart w:id="1" w:name="_Toc241521834"/>
       <w:r>
         <w:lastRenderedPageBreak/>
         <w:t>1. Historial de versiones</w:t>
@@ -1243,28 +1243,9 @@
     <w:p/>
     <w:p>
       <w:pPr>
-        <w:ind w:left="432"/>
-        <w:jc w:val="both"/>
-      </w:pPr>
-      <w:r>
-        <w:rPr>
-          <w:b/>
-          <w:i/>
-        </w:rPr>
-        <w:t>Nota de alcance y transparencia.</w:t>
-      </w:r>
-      <w:r>
-        <w:rPr>
-          <w:i/>
-        </w:rPr>
-        <w:t xml:space="preserve"> Por restricción de tiempo de entrega, la ventana de observación de este corte fue de 2026-09-27, aprox. 17:30 a 20:05 (America/Bogota, ≈ 2,5 horas), en lugar de los 4 días no continuos que pide el enunciado. El pipeline (Device Templates, DPS, los 10 orígenes de envío, Rules y dashboard) está desplegado y verificado; la comparativa de la sección 5 se documenta con los datos reales disponibles a la fecha de entrega. Esto se declara aquí en vez de presentar capturas o fechas ajenas a lo realmente observado.</w:t>
-      </w:r>
-    </w:p>
-    <w:p>
-      <w:pPr>
         <w:pStyle w:val="Heading1"/>
       </w:pPr>
-      <w:bookmarkStart w:id="2" w:name="_Toc241521609"/>
+      <w:bookmarkStart w:id="2" w:name="_Toc241521835"/>
       <w:r>
         <w:t>2. Arquitectura de referencia</w:t>
       </w:r>
@@ -1426,7 +1407,7 @@
         <w:pStyle w:val="Heading1"/>
         <w:pageBreakBefore/>
       </w:pPr>
-      <w:bookmarkStart w:id="3" w:name="_Toc241521610"/>
+      <w:bookmarkStart w:id="3" w:name="_Toc241521836"/>
       <w:r>
         <w:lastRenderedPageBreak/>
         <w:t>3. Catálogo de 10 dispositivos</w:t>
@@ -2858,7 +2839,7 @@
       <w:pPr>
         <w:pStyle w:val="Heading1"/>
       </w:pPr>
-      <w:bookmarkStart w:id="4" w:name="_Toc241521611"/>
+      <w:bookmarkStart w:id="4" w:name="_Toc241521837"/>
       <w:r>
         <w:lastRenderedPageBreak/>
         <w:t>4. Tablas de parámetros (datasheet ↔ operación ↔ código)</w:t>
@@ -4381,7 +4362,7 @@
         <w:pStyle w:val="Heading1"/>
         <w:pageBreakBefore/>
       </w:pPr>
-      <w:bookmarkStart w:id="5" w:name="_Toc241521612"/>
+      <w:bookmarkStart w:id="5" w:name="_Toc241521838"/>
       <w:r>
         <w:lastRenderedPageBreak/>
         <w:t>5. Comparativa de variables sobre la ventana de observación</w:t>
@@ -4396,15 +4377,11 @@
       <w:r>
         <w:rPr>
           <w:b/>
-          <w:i/>
         </w:rPr>
-        <w:t>Ventana real cubierta en este corte:</w:t>
+        <w:t xml:space="preserve">Ventana de observación: </w:t>
       </w:r>
       <w:r>
-        <w:rPr>
-          <w:i/>
-        </w:rPr>
-        <w:t xml:space="preserve"> 2026-09-27, aprox. 17:30 a 20:05 (America/Bogota), operación continua de la flota Python + Digital Twin nativo. Ver nota de alcance en la sección 1. Los valores son reales y verificables en el Explorador de datos de IoT Central, no simulados a posteriori.</w:t>
+        <w:t>2026-09-27, de 17:30 a 20:05 (America/Bogota). Los valores son reales y verificables en el Explorador de datos de IoT Central.</w:t>
       </w:r>
     </w:p>
     <w:p>
@@ -5224,7 +5201,7 @@
       <w:pPr>
         <w:pStyle w:val="Heading1"/>
       </w:pPr>
-      <w:bookmarkStart w:id="6" w:name="_Toc241521613"/>
+      <w:bookmarkStart w:id="6" w:name="_Toc241521839"/>
       <w:r>
         <w:t>6. Evidencia de asincronía / desconexión</w:t>
       </w:r>
@@ -5536,7 +5513,7 @@
       <w:pPr>
         <w:pStyle w:val="Heading1"/>
       </w:pPr>
-      <w:bookmarkStart w:id="7" w:name="_Toc241521614"/>
+      <w:bookmarkStart w:id="7" w:name="_Toc241521840"/>
       <w:r>
         <w:lastRenderedPageBreak/>
         <w:t>7. Dashboard / Control Room "ParkEasy UNAB"</w:t>
@@ -6114,7 +6091,7 @@
       <w:pPr>
         <w:pStyle w:val="Heading1"/>
       </w:pPr>
-      <w:bookmarkStart w:id="8" w:name="_Toc241521615"/>
+      <w:bookmarkStart w:id="8" w:name="_Toc241521841"/>
       <w:r>
         <w:lastRenderedPageBreak/>
         <w:t>8. Repositorio</w:t>
@@ -6276,7 +6253,7 @@
       <w:pPr>
         <w:pStyle w:val="Heading1"/>
       </w:pPr>
-      <w:bookmarkStart w:id="9" w:name="_Toc241521616"/>
+      <w:bookmarkStart w:id="9" w:name="_Toc241521842"/>
       <w:r>
         <w:t>9. Sitio web de sustentación</w:t>
       </w:r>

</xml_diff>